<commit_message>
Display location in model results
</commit_message>
<xml_diff>
--- a/report.docx
+++ b/report.docx
@@ -21,12 +21,34 @@
         <w:t xml:space="preserve">I have only recorded ‘Acceleration without g’ so that I can make my model more specialised since not all grading datasets will </w:t>
       </w:r>
       <w:r>
+        <w:t xml:space="preserve">include </w:t>
+      </w:r>
+      <w:r>
         <w:t>data from other types of sensors.</w:t>
       </w:r>
     </w:p>
     <w:p>
       <w:r>
-        <w:t xml:space="preserve">I have collected 6 datasets with varying durations (10s, 30s and 60s) and varying walking speeds (seen by the varying number of steps taken for each dataset). </w:t>
+        <w:t>I have collected 6 datasets with varying durations (30s and 60s)</w:t>
+      </w:r>
+      <w:r>
+        <w:t xml:space="preserve">, </w:t>
+      </w:r>
+      <w:r>
+        <w:t>varying walking speeds (seen by the varying number of steps taken for each dataset)</w:t>
+      </w:r>
+      <w:r>
+        <w:t xml:space="preserve"> and varying locations.</w:t>
+      </w:r>
+    </w:p>
+    <w:p>
+      <w:r>
+        <w:t>There are 3 locations that I have collected data from – HKU Underground Station, up and down a HU main building corridor and inside my HKU dorm.</w:t>
+      </w:r>
+    </w:p>
+    <w:p>
+      <w:r>
+        <w:t>In each location, there are 2 recordings, one 30s and one 60s to see if there are any differences in error rates for longer or shorter recordings.</w:t>
       </w:r>
     </w:p>
     <w:p>
@@ -39,7 +61,19 @@
     </w:p>
     <w:p>
       <w:r>
-        <w:t>Ground Truth steps are recorded by counting the steps taken mentally. Only when the foot lands on the ground will a step be counted. Ground truth steps are recording in a CSV file.</w:t>
+        <w:t>Ground Truth steps are recorded by counting the steps taken mentally. Only when the foot lands on the ground will a step be counted. Ground truth steps</w:t>
+      </w:r>
+      <w:r>
+        <w:t xml:space="preserve"> and data collection locations</w:t>
+      </w:r>
+      <w:r>
+        <w:t xml:space="preserve"> are record</w:t>
+      </w:r>
+      <w:r>
+        <w:t>ed</w:t>
+      </w:r>
+      <w:r>
+        <w:t xml:space="preserve"> in a CSV file.</w:t>
       </w:r>
     </w:p>
     <w:p>
@@ -64,22 +98,7 @@
         <w:t>Acceleration Magnitude Computation</w:t>
       </w:r>
     </w:p>
-    <w:p>
-      <w:r>
-        <w:t>I first computed the acceleration magnitude of the 3-axis accelerometer signal</w:t>
-      </w:r>
-      <w:r>
-        <w:t xml:space="preserve"> at each timestamp. This helps removes the dependence of on the phone’s orientation and ensures more consistent </w:t>
-      </w:r>
-      <w:r>
-        <w:t>step patterns independent on how the phone is held while recording data.</w:t>
-      </w:r>
-    </w:p>
-    <w:p>
-      <w:r>
-        <w:t>The acceleration magnitude is calculated using Euclidean norm.</w:t>
-      </w:r>
-    </w:p>
+    <w:p/>
     <w:p>
       <w:r>
         <w:rPr>
@@ -300,12 +319,510 @@
         <w:t>Results of recording and Error metrics</w:t>
       </w:r>
     </w:p>
+    <w:p>
+      <w:r>
+        <w:t>Individual dataset measurements and errors</w:t>
+      </w:r>
+    </w:p>
+    <w:tbl>
+      <w:tblPr>
+        <w:tblStyle w:val="TableGrid"/>
+        <w:tblW w:w="0" w:type="auto"/>
+        <w:tblLook w:val="04A0" w:firstRow="1" w:lastRow="0" w:firstColumn="1" w:lastColumn="0" w:noHBand="0" w:noVBand="1"/>
+      </w:tblPr>
+      <w:tblGrid>
+        <w:gridCol w:w="1795"/>
+        <w:gridCol w:w="2026"/>
+        <w:gridCol w:w="1991"/>
+        <w:gridCol w:w="1602"/>
+        <w:gridCol w:w="1602"/>
+      </w:tblGrid>
+      <w:tr>
+        <w:tc>
+          <w:tcPr>
+            <w:tcW w:w="1795" w:type="dxa"/>
+          </w:tcPr>
+          <w:p>
+            <w:r>
+              <w:t>Dataset</w:t>
+            </w:r>
+          </w:p>
+        </w:tc>
+        <w:tc>
+          <w:tcPr>
+            <w:tcW w:w="2026" w:type="dxa"/>
+          </w:tcPr>
+          <w:p>
+            <w:r>
+              <w:t>Step Counter Output</w:t>
+            </w:r>
+          </w:p>
+        </w:tc>
+        <w:tc>
+          <w:tcPr>
+            <w:tcW w:w="1991" w:type="dxa"/>
+          </w:tcPr>
+          <w:p>
+            <w:r>
+              <w:t>Ground Truth Value</w:t>
+            </w:r>
+          </w:p>
+        </w:tc>
+        <w:tc>
+          <w:tcPr>
+            <w:tcW w:w="1602" w:type="dxa"/>
+          </w:tcPr>
+          <w:p>
+            <w:r>
+              <w:t>Signed Error</w:t>
+            </w:r>
+          </w:p>
+        </w:tc>
+        <w:tc>
+          <w:tcPr>
+            <w:tcW w:w="1602" w:type="dxa"/>
+          </w:tcPr>
+          <w:p>
+            <w:r>
+              <w:t>Signed Error Percentage (%)</w:t>
+            </w:r>
+          </w:p>
+        </w:tc>
+      </w:tr>
+      <w:tr>
+        <w:tc>
+          <w:tcPr>
+            <w:tcW w:w="1795" w:type="dxa"/>
+          </w:tcPr>
+          <w:p>
+            <w:r>
+              <w:t>1</w:t>
+            </w:r>
+          </w:p>
+        </w:tc>
+        <w:tc>
+          <w:tcPr>
+            <w:tcW w:w="2026" w:type="dxa"/>
+          </w:tcPr>
+          <w:p>
+            <w:r>
+              <w:t>100</w:t>
+            </w:r>
+          </w:p>
+        </w:tc>
+        <w:tc>
+          <w:tcPr>
+            <w:tcW w:w="1991" w:type="dxa"/>
+          </w:tcPr>
+          <w:p>
+            <w:r>
+              <w:t>105</w:t>
+            </w:r>
+          </w:p>
+        </w:tc>
+        <w:tc>
+          <w:tcPr>
+            <w:tcW w:w="1602" w:type="dxa"/>
+          </w:tcPr>
+          <w:p>
+            <w:r>
+              <w:t>-5</w:t>
+            </w:r>
+          </w:p>
+        </w:tc>
+        <w:tc>
+          <w:tcPr>
+            <w:tcW w:w="1602" w:type="dxa"/>
+          </w:tcPr>
+          <w:p>
+            <w:r>
+              <w:t>-4.76</w:t>
+            </w:r>
+          </w:p>
+        </w:tc>
+      </w:tr>
+      <w:tr>
+        <w:tc>
+          <w:tcPr>
+            <w:tcW w:w="1795" w:type="dxa"/>
+          </w:tcPr>
+          <w:p>
+            <w:r>
+              <w:t>2</w:t>
+            </w:r>
+          </w:p>
+        </w:tc>
+        <w:tc>
+          <w:tcPr>
+            <w:tcW w:w="2026" w:type="dxa"/>
+          </w:tcPr>
+          <w:p>
+            <w:r>
+              <w:t>49</w:t>
+            </w:r>
+          </w:p>
+        </w:tc>
+        <w:tc>
+          <w:tcPr>
+            <w:tcW w:w="1991" w:type="dxa"/>
+          </w:tcPr>
+          <w:p>
+            <w:r>
+              <w:t>54</w:t>
+            </w:r>
+          </w:p>
+        </w:tc>
+        <w:tc>
+          <w:tcPr>
+            <w:tcW w:w="1602" w:type="dxa"/>
+          </w:tcPr>
+          <w:p>
+            <w:r>
+              <w:t>-5</w:t>
+            </w:r>
+          </w:p>
+        </w:tc>
+        <w:tc>
+          <w:tcPr>
+            <w:tcW w:w="1602" w:type="dxa"/>
+          </w:tcPr>
+          <w:p>
+            <w:r>
+              <w:t>-9.26</w:t>
+            </w:r>
+          </w:p>
+        </w:tc>
+      </w:tr>
+      <w:tr>
+        <w:tc>
+          <w:tcPr>
+            <w:tcW w:w="1795" w:type="dxa"/>
+          </w:tcPr>
+          <w:p>
+            <w:r>
+              <w:t>3</w:t>
+            </w:r>
+          </w:p>
+        </w:tc>
+        <w:tc>
+          <w:tcPr>
+            <w:tcW w:w="2026" w:type="dxa"/>
+          </w:tcPr>
+          <w:p>
+            <w:r>
+              <w:t>94</w:t>
+            </w:r>
+          </w:p>
+        </w:tc>
+        <w:tc>
+          <w:tcPr>
+            <w:tcW w:w="1991" w:type="dxa"/>
+          </w:tcPr>
+          <w:p>
+            <w:r>
+              <w:t>101</w:t>
+            </w:r>
+          </w:p>
+        </w:tc>
+        <w:tc>
+          <w:tcPr>
+            <w:tcW w:w="1602" w:type="dxa"/>
+          </w:tcPr>
+          <w:p>
+            <w:r>
+              <w:t>-</w:t>
+            </w:r>
+            <w:r>
+              <w:t>7</w:t>
+            </w:r>
+          </w:p>
+        </w:tc>
+        <w:tc>
+          <w:tcPr>
+            <w:tcW w:w="1602" w:type="dxa"/>
+          </w:tcPr>
+          <w:p>
+            <w:r>
+              <w:t>-6.93</w:t>
+            </w:r>
+          </w:p>
+        </w:tc>
+      </w:tr>
+      <w:tr>
+        <w:tc>
+          <w:tcPr>
+            <w:tcW w:w="1795" w:type="dxa"/>
+          </w:tcPr>
+          <w:p>
+            <w:r>
+              <w:t>4</w:t>
+            </w:r>
+          </w:p>
+        </w:tc>
+        <w:tc>
+          <w:tcPr>
+            <w:tcW w:w="2026" w:type="dxa"/>
+          </w:tcPr>
+          <w:p>
+            <w:r>
+              <w:t>43</w:t>
+            </w:r>
+          </w:p>
+        </w:tc>
+        <w:tc>
+          <w:tcPr>
+            <w:tcW w:w="1991" w:type="dxa"/>
+          </w:tcPr>
+          <w:p>
+            <w:r>
+              <w:t>40</w:t>
+            </w:r>
+          </w:p>
+        </w:tc>
+        <w:tc>
+          <w:tcPr>
+            <w:tcW w:w="1602" w:type="dxa"/>
+          </w:tcPr>
+          <w:p>
+            <w:r>
+              <w:t>3</w:t>
+            </w:r>
+          </w:p>
+        </w:tc>
+        <w:tc>
+          <w:tcPr>
+            <w:tcW w:w="1602" w:type="dxa"/>
+          </w:tcPr>
+          <w:p>
+            <w:r>
+              <w:t>7.50</w:t>
+            </w:r>
+          </w:p>
+        </w:tc>
+      </w:tr>
+      <w:tr>
+        <w:tc>
+          <w:tcPr>
+            <w:tcW w:w="1795" w:type="dxa"/>
+          </w:tcPr>
+          <w:p>
+            <w:r>
+              <w:t>5</w:t>
+            </w:r>
+          </w:p>
+        </w:tc>
+        <w:tc>
+          <w:tcPr>
+            <w:tcW w:w="2026" w:type="dxa"/>
+          </w:tcPr>
+          <w:p>
+            <w:r>
+              <w:t>77</w:t>
+            </w:r>
+          </w:p>
+        </w:tc>
+        <w:tc>
+          <w:tcPr>
+            <w:tcW w:w="1991" w:type="dxa"/>
+          </w:tcPr>
+          <w:p>
+            <w:r>
+              <w:t>72</w:t>
+            </w:r>
+          </w:p>
+        </w:tc>
+        <w:tc>
+          <w:tcPr>
+            <w:tcW w:w="1602" w:type="dxa"/>
+          </w:tcPr>
+          <w:p>
+            <w:r>
+              <w:t>5</w:t>
+            </w:r>
+          </w:p>
+        </w:tc>
+        <w:tc>
+          <w:tcPr>
+            <w:tcW w:w="1602" w:type="dxa"/>
+          </w:tcPr>
+          <w:p>
+            <w:r>
+              <w:t>6.94</w:t>
+            </w:r>
+          </w:p>
+        </w:tc>
+      </w:tr>
+      <w:tr>
+        <w:tc>
+          <w:tcPr>
+            <w:tcW w:w="1795" w:type="dxa"/>
+          </w:tcPr>
+          <w:p>
+            <w:r>
+              <w:t>6</w:t>
+            </w:r>
+          </w:p>
+        </w:tc>
+        <w:tc>
+          <w:tcPr>
+            <w:tcW w:w="2026" w:type="dxa"/>
+          </w:tcPr>
+          <w:p>
+            <w:r>
+              <w:t>45</w:t>
+            </w:r>
+          </w:p>
+        </w:tc>
+        <w:tc>
+          <w:tcPr>
+            <w:tcW w:w="1991" w:type="dxa"/>
+          </w:tcPr>
+          <w:p>
+            <w:r>
+              <w:t>42</w:t>
+            </w:r>
+          </w:p>
+        </w:tc>
+        <w:tc>
+          <w:tcPr>
+            <w:tcW w:w="1602" w:type="dxa"/>
+          </w:tcPr>
+          <w:p>
+            <w:r>
+              <w:t>3</w:t>
+            </w:r>
+          </w:p>
+        </w:tc>
+        <w:tc>
+          <w:tcPr>
+            <w:tcW w:w="1602" w:type="dxa"/>
+          </w:tcPr>
+          <w:p>
+            <w:r>
+              <w:t>7.14</w:t>
+            </w:r>
+          </w:p>
+        </w:tc>
+      </w:tr>
+    </w:tbl>
     <w:p/>
+    <w:p>
+      <w:r>
+        <w:t>Summary of all 6 datasets</w:t>
+      </w:r>
+    </w:p>
+    <w:tbl>
+      <w:tblPr>
+        <w:tblStyle w:val="TableGrid"/>
+        <w:tblW w:w="0" w:type="auto"/>
+        <w:tblLook w:val="04A0" w:firstRow="1" w:lastRow="0" w:firstColumn="1" w:lastColumn="0" w:noHBand="0" w:noVBand="1"/>
+      </w:tblPr>
+      <w:tblGrid>
+        <w:gridCol w:w="2254"/>
+        <w:gridCol w:w="2254"/>
+        <w:gridCol w:w="2254"/>
+        <w:gridCol w:w="2254"/>
+      </w:tblGrid>
+      <w:tr>
+        <w:tc>
+          <w:tcPr>
+            <w:tcW w:w="2254" w:type="dxa"/>
+          </w:tcPr>
+          <w:p>
+            <w:r>
+              <w:t>Mean Error</w:t>
+            </w:r>
+          </w:p>
+        </w:tc>
+        <w:tc>
+          <w:tcPr>
+            <w:tcW w:w="2254" w:type="dxa"/>
+          </w:tcPr>
+          <w:p>
+            <w:r>
+              <w:t>Mean Absolute Error</w:t>
+            </w:r>
+          </w:p>
+        </w:tc>
+        <w:tc>
+          <w:tcPr>
+            <w:tcW w:w="2254" w:type="dxa"/>
+          </w:tcPr>
+          <w:p>
+            <w:r>
+              <w:t>Root Mean Squared Error</w:t>
+            </w:r>
+          </w:p>
+        </w:tc>
+        <w:tc>
+          <w:tcPr>
+            <w:tcW w:w="2254" w:type="dxa"/>
+          </w:tcPr>
+          <w:p>
+            <w:r>
+              <w:t>Mean Absolute Percentage Error (%)</w:t>
+            </w:r>
+          </w:p>
+        </w:tc>
+      </w:tr>
+      <w:tr>
+        <w:tc>
+          <w:tcPr>
+            <w:tcW w:w="2254" w:type="dxa"/>
+          </w:tcPr>
+          <w:p>
+            <w:r>
+              <w:t>-1.0</w:t>
+            </w:r>
+          </w:p>
+        </w:tc>
+        <w:tc>
+          <w:tcPr>
+            <w:tcW w:w="2254" w:type="dxa"/>
+          </w:tcPr>
+          <w:p>
+            <w:r>
+              <w:t>4.67</w:t>
+            </w:r>
+          </w:p>
+        </w:tc>
+        <w:tc>
+          <w:tcPr>
+            <w:tcW w:w="2254" w:type="dxa"/>
+          </w:tcPr>
+          <w:p>
+            <w:r>
+              <w:t>4.86</w:t>
+            </w:r>
+          </w:p>
+        </w:tc>
+        <w:tc>
+          <w:tcPr>
+            <w:tcW w:w="2254" w:type="dxa"/>
+          </w:tcPr>
+          <w:p>
+            <w:r>
+              <w:t>7.09</w:t>
+            </w:r>
+          </w:p>
+        </w:tc>
+      </w:tr>
+    </w:tbl>
+    <w:p/>
+    <w:p>
+      <w:r>
+        <w:rPr>
+          <w:highlight w:val="yellow"/>
+        </w:rPr>
+        <w:t>&lt;Insert calculation formula for each error metric&gt;</w:t>
+      </w:r>
+    </w:p>
     <w:p>
       <w:pPr>
         <w:pStyle w:val="Heading1"/>
       </w:pPr>
       <w:r>
+        <w:lastRenderedPageBreak/>
         <w:t>Realtime Visualisation</w:t>
       </w:r>
     </w:p>
@@ -318,7 +835,32 @@
         <w:t>Limitations and Failure Cases</w:t>
       </w:r>
     </w:p>
-    <w:p/>
+    <w:p>
+      <w:r>
+        <w:t xml:space="preserve">Firstly, this model only considers acceleration magnitude and does not consider the other sensors that can in incorporated such as the gyroscope and </w:t>
+      </w:r>
+      <w:r>
+        <w:t>magnetometer</w:t>
+      </w:r>
+      <w:r>
+        <w:t>. Thus, this model may perform worse compared to other models that consider these aspects.</w:t>
+      </w:r>
+    </w:p>
+    <w:p>
+      <w:r>
+        <w:t>Secondly, this model relies on the difference between a (most recent valley before the peak) valley and a peak to detect steps. Thus, movements that generate a less significant difference (below the threshold) will potentially not register as a step. Examples of such movements are shuffling and tiptoeing.</w:t>
+      </w:r>
+    </w:p>
+    <w:p>
+      <w:r>
+        <w:t>Thirdly, I have used a cadence limit that checks the minimum step pacing and disregards peaks that occur too rapidly. I found that this allowed me to reduce my error rate from random phone rotations but may limit the model in certain situations. Examples of such situations is fast paced running or tap dancing.</w:t>
+      </w:r>
+    </w:p>
+    <w:p>
+      <w:r>
+        <w:t>Lastly, this model is generalised and requires manual tuning of parameters. It cannot tune its parameters on the fly to personalise the model for the person walking.</w:t>
+      </w:r>
+    </w:p>
     <w:sectPr>
       <w:pgSz w:w="11906" w:h="16838"/>
       <w:pgMar w:top="1440" w:right="1440" w:bottom="1440" w:left="1440" w:header="708" w:footer="708" w:gutter="0"/>
@@ -1028,6 +1570,7 @@
   <w:style w:type="character" w:default="1" w:styleId="DefaultParagraphFont">
     <w:name w:val="Default Paragraph Font"/>
     <w:uiPriority w:val="1"/>
+    <w:semiHidden/>
     <w:unhideWhenUsed/>
   </w:style>
   <w:style w:type="table" w:default="1" w:styleId="TableNormal">
@@ -1339,6 +1882,25 @@
       <w:color w:val="0F4761" w:themeColor="accent1" w:themeShade="BF"/>
       <w:spacing w:val="5"/>
     </w:rPr>
+  </w:style>
+  <w:style w:type="table" w:styleId="TableGrid">
+    <w:name w:val="Table Grid"/>
+    <w:basedOn w:val="TableNormal"/>
+    <w:uiPriority w:val="39"/>
+    <w:rsid w:val="00C376A5"/>
+    <w:pPr>
+      <w:spacing w:after="0" w:line="240" w:lineRule="auto"/>
+    </w:pPr>
+    <w:tblPr>
+      <w:tblBorders>
+        <w:top w:val="single" w:sz="4" w:space="0" w:color="auto"/>
+        <w:left w:val="single" w:sz="4" w:space="0" w:color="auto"/>
+        <w:bottom w:val="single" w:sz="4" w:space="0" w:color="auto"/>
+        <w:right w:val="single" w:sz="4" w:space="0" w:color="auto"/>
+        <w:insideH w:val="single" w:sz="4" w:space="0" w:color="auto"/>
+        <w:insideV w:val="single" w:sz="4" w:space="0" w:color="auto"/>
+      </w:tblBorders>
+    </w:tblPr>
   </w:style>
 </w:styles>
 </file>

</xml_diff>